<commit_message>
Strengthen A2 evidence, measurement appraisal and testing plan
</commit_message>
<xml_diff>
--- a/deliverables/assessment-2/A2_Speaker_Script.docx
+++ b/deliverables/assessment-2/A2_Speaker_Script.docx
@@ -29,7 +29,7 @@
         <w:rPr>
           <w:sz w:val="20"/>
         </w:rPr>
-        <w:t>710 spoken words. Present slides 1–8; references and appendices are for reading. Aim for 120–125 words per minute with brief pauses, then rehearse to the 5:30–6:30 allowance.</w:t>
+        <w:t>605 spoken words. Present slides 1–8; references and appendices are for reading. Aim for about 105–110 words per minute, with pauses at the logic model and comparison table. The timestamps are rehearsal guides; practise to the 5:30–6:30 allowance.</w:t>
       </w:r>
     </w:p>
     <w:p>
@@ -38,7 +38,7 @@
         <w:keepNext/>
       </w:pPr>
       <w:r>
-        <w:t>Slide 1 | 0:00–0:30 | Beyond Toy Counts</w:t>
+        <w:t>Slide 1 | 0:00–0:20 | Beyond Toy Counts</w:t>
       </w:r>
     </w:p>
     <w:p>
@@ -46,7 +46,7 @@
         <w:spacing w:after="160"/>
       </w:pPr>
       <w:r>
-        <w:t>Hello, I'm Yangyang Xiao. Joy of Giving redistributes toys and books, and our team must explain its social and environmental contribution. My research asks how a brief parent survey can assess perceived changes in access to suitable play resources. I propose a small set of targeted questions, with clear rules for what the answers can tell us.</w:t>
+        <w:t>Hello, I'm Yangyang Xiao. My research asks how a brief parent survey can describe families' reported changes in access to suitable play resources after a Joy of Giving visit. The contribution is a measurement framework for our impact report.</w:t>
       </w:r>
     </w:p>
     <w:p>
@@ -55,7 +55,7 @@
         <w:keepNext/>
       </w:pPr>
       <w:r>
-        <w:t>Slide 2 | 0:30–1:00 | An evidence-informed indicator review</w:t>
+        <w:t>Slide 2 | 0:20–1:00 | Evidence roles and appraisal criteria</w:t>
       </w:r>
     </w:p>
     <w:p>
@@ -63,7 +63,7 @@
         <w:spacing w:after="160"/>
       </w:pPr>
       <w:r>
-        <w:t>This is a desk-based design study, not a completed family survey. I reviewed course frameworks and five official methods documents from three institutions, then compared measurement options against relevance, respondent burden, feasibility and interpretation. The resulting questions are proposals for testing. They have not been validated for Joy of Giving, and no participant outcomes are estimated here.</w:t>
+        <w:t>I used a desk-based review, comparing measurement options against relevance, respondent burden, feasibility and interpretation. Toy Libraries Australia supplies sector evidence about access, cost and appropriate toys. The ONS report supports questionnaire testing, while World Bank and GDS guidance informs measurement and administration. Each source has a different role. These proposed items have not been validated in Joy of Giving, and I collected no participant data.</w:t>
       </w:r>
     </w:p>
     <w:p>
@@ -72,7 +72,7 @@
         <w:keepNext/>
       </w:pPr>
       <w:r>
-        <w:t>Slide 3 | 1:00–2:00 | Measure access beyond redistribution</w:t>
+        <w:t>Slide 3 | 1:00–1:35 | Separate the outcome from its evidence</w:t>
       </w:r>
     </w:p>
     <w:p>
@@ -80,7 +80,7 @@
         <w:spacing w:after="160"/>
       </w:pPr>
       <w:r>
-        <w:t>The first distinction is between activity and change. Toy counts show what the organisation distributed. Family counts show reach. Neither establishes whether a child could access suitable resources more easily. In a proposed logic model, redistribution is the activity, items received are outputs, and easier access is an intended short-term outcome. That link depends on whether items suit the child, reach the household and remain usable. General satisfaction answers another question: whether the service experience was positive. It is useful feedback, but a positive experience can coexist with unchanged access. For the impact report, keep output counts, service feedback and reported access change in separate categories. Longer-term child development remains outside this study.</w:t>
+        <w:t>The intended outcome is improved access to suitable play resources. Toy redistribution is the activity, and items received are outputs. Family-reported access change is evidence about the outcome, rather than the outcome itself. Satisfaction describes service experience. Keeping these separate prevents a positive service rating or a toy count from standing in for improved access.</w:t>
       </w:r>
     </w:p>
     <w:p>
@@ -89,7 +89,7 @@
         <w:keepNext/>
       </w:pPr>
       <w:r>
-        <w:t>Slide 4 | 2:00–3:00 | Define access before writing questions</w:t>
+        <w:t>Slide 4 | 1:35–2:35 | Evidence informs indicator selection</w:t>
       </w:r>
     </w:p>
     <w:p>
@@ -97,7 +97,7 @@
         <w:spacing w:after="160"/>
       </w:pPr>
       <w:r>
-        <w:t>My second conclusion is to treat access as several related questions, rather than one untested score. Availability concerns whether a family can obtain relevant resources when needed. Affordability concerns cost barriers. Suitability concerns whether items meet the nominated child's play needs. These are candidate dimensions for client review and family testing. Actual use supplies context: receiving an item does not tell us whether it was used. But frequent use also does not prove that access improved or that development changed. Week five's systems perspective adds a question: could transport, storage or household circumstances explain the answer? A neutral open question can reveal constraints without assuming that every family benefited.</w:t>
+        <w:t>Toy Libraries Australia's submission changes the proposed content. It reports wider choice and saving money as joining motives, describes uneven service access, and presents developmentally appropriate toys as a benefit. I therefore retain overall access change, cost barriers and perceived suitability. This sector submission reports market research without full survey methods. Lending also differs from redistribution, so it suggests candidates rather than validating this questionnaire. Availability remains a coverage gap because Q1 does not measure it separately. Q2 and Q3 provide context, while Q4 records use and Q5 asks about barriers. Transport, storage and household circumstances may help explain an answer.</w:t>
       </w:r>
     </w:p>
     <w:p>
@@ -111,7 +111,7 @@
         <w:keepNext/>
       </w:pPr>
       <w:r>
-        <w:t>Slide 5 | 3:00–4:00 | Comparing measurement options</w:t>
+        <w:t>Slide 5 | 2:35–3:45 | Measurement options and design choice</w:t>
       </w:r>
     </w:p>
     <w:p>
@@ -119,7 +119,7 @@
         <w:spacing w:after="160"/>
       </w:pPr>
       <w:r>
-        <w:t>The comparison shows why no single measure is sufficient. Distribution records can be reused to describe programme activity, but do not measure household change. A satisfaction question is simple, but only indirectly related to access. A direct change question fits the outcome more closely, although it asks parents to recall an earlier period. A short set of specific questions plus a comment provides more interpretation, at the cost of extra response time and analysis. A longer instrument also requires staff time to check incomplete responses and code open comments. My recommendation is a brief combination, with each item earning its place. Retain an item only if its answer informs a report claim or a decision. Its actual burden should be tested, rather than assumed.</w:t>
+        <w:t>The matrix applies all four criteria. Relevance comes first because access change is the research question; feasibility then limits what fits before A3. Usable records can have low burden but mainly describe activity. Satisfaction is simple but weakly aligned with access change. Retrospective change needs one follow-up, but relies on recall. Prospective baseline and follow-up reduces reliance on recalled change, but needs two waves, comparable questions, linkage and enough time; attrition remains. My conditional choice is retrospective change plus contextual items if an eligible four-week follow-up fits. Prefer a suitable prospective design if feasible. If neither fits, audit existing questions and data. Burden and interpretation remain constraints. These are design judgements, not measured ratings.</w:t>
       </w:r>
     </w:p>
     <w:p>
@@ -128,7 +128,7 @@
         <w:keepNext/>
       </w:pPr>
       <w:r>
-        <w:t>Slide 6 | 4:00–5:00 | Five questions, each with a clear purpose</w:t>
+        <w:t>Slide 6 | 3:45–4:15 | One main indicator; four supporting items</w:t>
       </w:r>
     </w:p>
     <w:p>
@@ -136,7 +136,7 @@
         <w:spacing w:after="160"/>
       </w:pPr>
       <w:r>
-        <w:t>The draft has five questions: perceived access change, cost barriers, suitability, recent use and a neutral explanation, including difficulties. I propose inviting adult carers four weeks after a selected visit, with clear before-and-after periods for the change question. This timing is a design choice to pilot, not an established optimum. Explain which child and resources to consider. Include uncertainty where valid, leave response options unselected, and let respondents review answers before submitting. Keep the change categories separate, and show missing and uncertain responses. Cost, suitability and use provide context; they should not be added into an unvalidated total. The full wording is in the appendix. Testing must check comprehension as well as completion time. Ask carers to explain each question in their own words before finalising it.</w:t>
+        <w:t>The items have distinct reporting roles. Q1 is the main reported access-change indicator. Q2 covers cost, Q3 perceived suitability, and Q4 recent use; these provide context. Q5 helps explain change and barriers. Report categories and valid item counts, while showing uncertain and skipped answers separately. Do not combine the answers into an access score.</w:t>
       </w:r>
     </w:p>
     <w:p>
@@ -145,7 +145,7 @@
         <w:keepNext/>
       </w:pPr>
       <w:r>
-        <w:t>Slide 7 | 5:00–5:30 | Reported change has limits</w:t>
+        <w:t>Slide 7 | 4:15–4:45 | Match each claim to the study design</w:t>
       </w:r>
     </w:p>
     <w:p>
@@ -153,7 +153,7 @@
         <w:spacing w:after="160"/>
       </w:pPr>
       <w:r>
-        <w:t>The main limitation is that recalled change is not a causal estimate. More engaged families may be more likely to respond, while other household changes may affect access. Say 'among responding families' and specify the period. Records and interviews strengthen interpretation but cannot establish the counterfactual. The general guidance also needs testing in this particular family and toy context.</w:t>
+        <w:t>Recall can distort the comparison, and responding families may differ from others. Specify the reference periods and say 'among responding families'. Without an adequate comparison, neither retrospective nor prospective responses establish programme effects. Records and interviews can help interpret accounts, but do not remove that limitation.</w:t>
       </w:r>
     </w:p>
     <w:p>
@@ -162,7 +162,7 @@
         <w:keepNext/>
       </w:pPr>
       <w:r>
-        <w:t>Slide 8 | 5:30–6:00 | Turn the framework into a team deliverable</w:t>
+        <w:t>Slide 8 | 4:45–6:00 | Testing plan and A3 feasibility</w:t>
       </w:r>
     </w:p>
     <w:p>
@@ -170,7 +170,7 @@
         <w:spacing w:after="160"/>
       </w:pPr>
       <w:r>
-        <w:t>Before Assessment Three, agree the priority outcome with the client, test understanding and burden with adult carers, then revise and compare responses with available records or interviews. The team receives a questionnaire, an indicator dictionary and reporting rules. These support both the impact report and public communication. My contribution is a way to describe reported access change while matching every claim to the evidence.</w:t>
+        <w:t>First, ask the client or tutor to arrange recruitment and confirm contact arrangements, baseline data and the A3 analysis deadline. Check whether families already passed four weeks; a new wait must still leave analysis and writing time. Second, I propose three to five adult-carer cognitive interviews, probing question meaning, recall periods and answer choices. Log misunderstandings, missing options and form completion time. The proposed three-minute form target excludes interview probes. Following ONS, add an end-to-end walkthrough if digital; UX also checks understanding. Third, reword unclear terms, add options, remove unnecessary items and recheck changes. If the survey is fixed or time too short, audit current questions and data, then recommend the next cycle. The team receives the survey, indicator guide and reporting rules for its impact report and media collateral.</w:t>
       </w:r>
     </w:p>
     <w:sectPr>

</xml_diff>